<commit_message>
design: nuovo logo OPENGRAFO — bracci asimmetrici, archi al bordo nodi, cyan-500
- opengrafo-logo.svg: viewBox 320×90, coordinate nodi/archi ridisegnate con
  lunghezze diverse e linee che si fermano al perimetro dei cerchi
- opengrafo-icon.svg: viewBox 90×90, stesse coordinate del logo (senza wordmark)
- Colore principale aggiornato da cyan-600 (#0284c7) a cyan-500 (#0ea5e9)
- OpenGrafo_Architettura_v12.docx: aggiunte sezioni 6.7 (Live Topology Map) e
  6.8 (Fix Architetturale tipo CI da label), aggiornate tabelle Stato
  Implementazione, mappa file e Roadmap

Co-Authored-By: Claude Sonnet 4.6 <noreply@anthropic.com>
</commit_message>
<xml_diff>
--- a/OpenGrafo_Architettura_v12.docx
+++ b/OpenGrafo_Architettura_v12.docx
@@ -10626,6 +10626,344 @@
     </w:p>
     <w:p>
       <w:pPr>
+        <w:pStyle w:val="Heading2"/>
+      </w:pPr>
+      <w:r>
+        <w:t xml:space="preserve">6.7 Feature v12.0 — Live Topology Map</w:t>
+      </w:r>
+    </w:p>
+    <w:p>
+      <w:pPr>
+        <w:pStyle w:val="Normal"/>
+      </w:pPr>
+      <w:r>
+        <w:t xml:space="preserve">Pagina /topology con visualizzazione D3.js force-simulation del grafo CMDB. I nodi rappresentano CI, gli archi le dipendenze (DEPENDS_ON / HOSTED_ON). Ottimizzata per grafi grandi con simulazione incrementale e zoom/pan SVG.</w:t>
+      </w:r>
+    </w:p>
+    <w:p>
+      <w:pPr>
+        <w:pStyle w:val="Heading3"/>
+      </w:pPr>
+      <w:r>
+        <w:t xml:space="preserve">Funzionalità</w:t>
+      </w:r>
+    </w:p>
+    <w:p>
+      <w:pPr>
+        <w:pStyle w:val="ListBullet"/>
+      </w:pPr>
+      <w:r>
+        <w:t xml:space="preserve">Filtro tipo CI dinamico — dropdown popolato da GET_CI_TYPES (metamodello), include tipi custom definiti dal tenant</w:t>
+      </w:r>
+    </w:p>
+    <w:p>
+      <w:pPr>
+        <w:pStyle w:val="ListBullet"/>
+      </w:pPr>
+      <w:r>
+        <w:t xml:space="preserve">Filtro ambiente (production / staging / development / all)</w:t>
+      </w:r>
+    </w:p>
+    <w:p>
+      <w:pPr>
+        <w:pStyle w:val="ListBullet"/>
+      </w:pPr>
+      <w:r>
+        <w:t xml:space="preserve">Ricerca nodo per nome con highlight</w:t>
+      </w:r>
+    </w:p>
+    <w:p>
+      <w:pPr>
+        <w:pStyle w:val="ListBullet"/>
+      </w:pPr>
+      <w:r>
+        <w:t xml:space="preserve">Zoom in/out e reset viewport (pulsanti + scroll wheel)</w:t>
+      </w:r>
+    </w:p>
+    <w:p>
+      <w:pPr>
+        <w:pStyle w:val="ListBullet"/>
+      </w:pPr>
+      <w:r>
+        <w:t xml:space="preserve">Tooltip on hover: nome, tipo, ambiente, stato</w:t>
+      </w:r>
+    </w:p>
+    <w:p>
+      <w:pPr>
+        <w:pStyle w:val="ListBullet"/>
+      </w:pPr>
+      <w:r>
+        <w:t xml:space="preserve">Click nodo → navigazione a /ci/:id</w:t>
+      </w:r>
+    </w:p>
+    <w:p>
+      <w:pPr>
+        <w:pStyle w:val="Heading3"/>
+      </w:pPr>
+      <w:r>
+        <w:t xml:space="preserve">Architettura</w:t>
+      </w:r>
+    </w:p>
+    <w:p>
+      <w:pPr>
+        <w:pStyle w:val="ListBullet"/>
+      </w:pPr>
+      <w:r>
+        <w:t xml:space="preserve">useQuery(GET_TOPOLOGY, { variables: { type, environment }, fetchPolicy: "cache-first" })</w:t>
+      </w:r>
+    </w:p>
+    <w:p>
+      <w:pPr>
+        <w:pStyle w:val="ListBullet"/>
+      </w:pPr>
+      <w:r>
+        <w:t xml:space="preserve">useQuery(GET_CI_TYPES) per dropdown dinamico — risultato memo-izzato in ciTypeOptions</w:t>
+      </w:r>
+    </w:p>
+    <w:p>
+      <w:pPr>
+        <w:pStyle w:val="ListBullet"/>
+      </w:pPr>
+      <w:r>
+        <w:t xml:space="preserve">D3 forceSimulation: forceLink (distanza 120), forceManyBody (strength −150), forceCenter</w:t>
+      </w:r>
+    </w:p>
+    <w:p>
+      <w:pPr>
+        <w:pStyle w:val="ListBullet"/>
+      </w:pPr>
+      <w:r>
+        <w:t xml:space="preserve">SVG con g.links + g.nodes; transition "tick" aggiorna cx/cy e x1/y1/x2/y2</w:t>
+      </w:r>
+    </w:p>
+    <w:p>
+      <w:pPr>
+        <w:pStyle w:val="ListBullet"/>
+      </w:pPr>
+      <w:r>
+        <w:t xml:space="preserve">Colori nodi: palette 12 colori ciclica indicizzata per tipo CI</w:t>
+      </w:r>
+    </w:p>
+    <w:p>
+      <w:pPr>
+        <w:pStyle w:val="Heading3"/>
+      </w:pPr>
+      <w:r>
+        <w:t xml:space="preserve">Schema GraphQL</w:t>
+      </w:r>
+    </w:p>
+    <w:p>
+      <w:pPr>
+        <w:pStyle w:val="ListBullet"/>
+      </w:pPr>
+      <w:r>
+        <w:t xml:space="preserve">Query topology(type: String, environment: String): TopologyData</w:t>
+      </w:r>
+    </w:p>
+    <w:p>
+      <w:pPr>
+        <w:pStyle w:val="ListBullet"/>
+      </w:pPr>
+      <w:r>
+        <w:t xml:space="preserve">type TopologyNode { id, name, type, environment, status }</w:t>
+      </w:r>
+    </w:p>
+    <w:p>
+      <w:pPr>
+        <w:pStyle w:val="ListBullet"/>
+      </w:pPr>
+      <w:r>
+        <w:t xml:space="preserve">type TopologyEdge { source, target, relationType }</w:t>
+      </w:r>
+    </w:p>
+    <w:p>
+      <w:pPr>
+        <w:pStyle w:val="ListBullet"/>
+      </w:pPr>
+      <w:r>
+        <w:t xml:space="preserve">type TopologyData { nodes: [TopologyNode!]!, edges: [TopologyEdge!]! }</w:t>
+      </w:r>
+    </w:p>
+    <w:p>
+      <w:pPr>
+        <w:pStyle w:val="Normal"/>
+      </w:pPr>
+    </w:p>
+    <w:p>
+      <w:pPr>
+        <w:pStyle w:val="Heading2"/>
+      </w:pPr>
+      <w:r>
+        <w:t xml:space="preserve">6.8 Fix Architetturale — Tipo CI da Label Neo4j</w:t>
+      </w:r>
+    </w:p>
+    <w:p>
+      <w:pPr>
+        <w:pStyle w:val="Normal"/>
+      </w:pPr>
+      <w:r>
+        <w:t xml:space="preserve">Refactor completo per derivare il tipo dei CI dai label Neo4j anzichè dalla proprietà ci.type (che era sempre null). Il tipo è ora estratto esclusivamente dai label del nodo: ogni nodo CI porta label :ConfigurationItem + :Application (o :Database, :Server, ecc.).</w:t>
+      </w:r>
+    </w:p>
+    <w:p>
+      <w:pPr>
+        <w:pStyle w:val="Heading3"/>
+      </w:pPr>
+      <w:r>
+        <w:t xml:space="preserve">Root Cause del Bug</w:t>
+      </w:r>
+    </w:p>
+    <w:p>
+      <w:pPr>
+        <w:pStyle w:val="ListBullet"/>
+      </w:pPr>
+      <w:r>
+        <w:t xml:space="preserve">ci.type era sempre null nei nodi Neo4j — il tipo era scritto solo come label, mai come property</w:t>
+      </w:r>
+    </w:p>
+    <w:p>
+      <w:pPr>
+        <w:pStyle w:val="ListBullet"/>
+      </w:pPr>
+      <w:r>
+        <w:t xml:space="preserve">buildAllCIsResolver leggeva args.ciType anzichè args.type → filtro sempre vuoto → sempre tutti i tipi</w:t>
+      </w:r>
+    </w:p>
+    <w:p>
+      <w:pPr>
+        <w:pStyle w:val="ListBullet"/>
+      </w:pPr>
+      <w:r>
+        <w:t xml:space="preserve">labelToType() in ci-utils.ts aveva mappa parziale — fallback "application" per tipi non riconosciuti</w:t>
+      </w:r>
+    </w:p>
+    <w:p>
+      <w:pPr>
+        <w:pStyle w:val="ListBullet"/>
+      </w:pPr>
+      <w:r>
+        <w:t xml:space="preserve">Script seed usavano MATCH (c:ConfigurationItem) + WHERE c.type IN [...] invece di label filtering</w:t>
+      </w:r>
+    </w:p>
+    <w:p>
+      <w:pPr>
+        <w:pStyle w:val="Heading3"/>
+      </w:pPr>
+      <w:r>
+        <w:t xml:space="preserve">Soluzione Architetturale</w:t>
+      </w:r>
+    </w:p>
+    <w:p>
+      <w:pPr>
+        <w:pStyle w:val="ListBullet"/>
+      </w:pPr>
+      <w:r>
+        <w:t xml:space="preserve">ciTypeFromLabels(labels: string[]): string — funzione centrale in apps/api/src/lib/ciTypeFromLabels.ts</w:t>
+      </w:r>
+    </w:p>
+    <w:p>
+      <w:pPr>
+        <w:pStyle w:val="ListBullet"/>
+      </w:pPr>
+      <w:r>
+        <w:t xml:space="preserve">Mappa statica per 12 tipi built-in (Application→application, DatabaseInstance→database_instance, ecc.)</w:t>
+      </w:r>
+    </w:p>
+    <w:p>
+      <w:pPr>
+        <w:pStyle w:val="ListBullet"/>
+      </w:pPr>
+      <w:r>
+        <w:t xml:space="preserve">Mappa dinamica populata da registerCITypes() dopo loadMetamodel() in schemaCache.ts</w:t>
+      </w:r>
+    </w:p>
+    <w:p>
+      <w:pPr>
+        <w:pStyle w:val="ListBullet"/>
+      </w:pPr>
+      <w:r>
+        <w:t xml:space="preserve">Fallback: primo label non-tecnico lowercased (esclude ConfigurationItem, CIBase, _BaseNode)</w:t>
+      </w:r>
+    </w:p>
+    <w:p>
+      <w:pPr>
+        <w:pStyle w:val="Heading3"/>
+      </w:pPr>
+      <w:r>
+        <w:t xml:space="preserve">File Modificati</w:t>
+      </w:r>
+    </w:p>
+    <w:p>
+      <w:pPr>
+        <w:pStyle w:val="ListBullet"/>
+      </w:pPr>
+      <w:r>
+        <w:t xml:space="preserve">apps/api/src/lib/ciTypeFromLabels.ts (NUOVO) — mappa statica + dinamica, registerCITypes, ciTypeFromLabels</w:t>
+      </w:r>
+    </w:p>
+    <w:p>
+      <w:pPr>
+        <w:pStyle w:val="ListBullet"/>
+      </w:pPr>
+      <w:r>
+        <w:t xml:space="preserve">apps/api/src/lib/schemaCache.ts — chiama registerCITypes(types) dopo loadMetamodel()</w:t>
+      </w:r>
+    </w:p>
+    <w:p>
+      <w:pPr>
+        <w:pStyle w:val="ListBullet"/>
+      </w:pPr>
+      <w:r>
+        <w:t xml:space="preserve">apps/api/src/graphql/resolvers/dynamic-ci.ts — args.ciType → args.type; rimossa property type dal CREATE</w:t>
+      </w:r>
+    </w:p>
+    <w:p>
+      <w:pPr>
+        <w:pStyle w:val="ListBullet"/>
+      </w:pPr>
+      <w:r>
+        <w:t xml:space="preserve">apps/api/src/graphql/resolvers/ci-utils.ts — labelToType() ora wrapper di ciTypeFromLabels</w:t>
+      </w:r>
+    </w:p>
+    <w:p>
+      <w:pPr>
+        <w:pStyle w:val="ListBullet"/>
+      </w:pPr>
+      <w:r>
+        <w:t xml:space="preserve">apps/api/src/graphql/resolvers/topology.ts — usa ciTypeFromLabels anzichè .toLowerCase()</w:t>
+      </w:r>
+    </w:p>
+    <w:p>
+      <w:pPr>
+        <w:pStyle w:val="ListBullet"/>
+      </w:pPr>
+      <w:r>
+        <w:t xml:space="preserve">apps/api/src/graphql/resolvers/cmdb.ts, ci.ts, change.ts, incident.ts, team.ts, problem.ts — import aggiornati</w:t>
+      </w:r>
+    </w:p>
+    <w:p>
+      <w:pPr>
+        <w:pStyle w:val="ListBullet"/>
+      </w:pPr>
+      <w:r>
+        <w:t xml:space="preserve">apps/api/src/scripts/seed-apps.ts, seed-databases.ts, seed-servers.ts, seed-database-instances.ts — label corretti nel MERGE, rimosso SET c.type</w:t>
+      </w:r>
+    </w:p>
+    <w:p>
+      <w:pPr>
+        <w:pStyle w:val="ListBullet"/>
+      </w:pPr>
+      <w:r>
+        <w:t xml:space="preserve">apps/web/src/pages/topology/TopologyPage.tsx — dropdown dinamico da GET_CI_TYPES</w:t>
+      </w:r>
+    </w:p>
+    <w:p>
+      <w:pPr>
+        <w:pStyle w:val="Normal"/>
+      </w:pPr>
+    </w:p>
+    <w:p>
+      <w:pPr>
         <w:pStyle w:val="Heading1"/>
       </w:pPr>
       <w:r>
@@ -14012,6 +14350,94 @@
           </w:p>
         </w:tc>
       </w:tr>
+      <w:tr>
+        <w:tc>
+          <w:tcPr>
+            <w:tcW w:type="dxa" w:w="4536"/>
+          </w:tcPr>
+          <w:p>
+            <w:r>
+              <w:t>apps/api/src/lib/ciTypeFromLabels.ts</w:t>
+            </w:r>
+          </w:p>
+        </w:tc>
+        <w:tc>
+          <w:tcPr>
+            <w:tcW w:type="dxa" w:w="4536"/>
+          </w:tcPr>
+          <w:p>
+            <w:r>
+              <w:t>Mappa label→tipo CI (statica+dinamica), registerCITypes(), ciTypeFromLabels() — single source of truth</w:t>
+            </w:r>
+          </w:p>
+        </w:tc>
+      </w:tr>
+      <w:tr>
+        <w:tc>
+          <w:tcPr>
+            <w:tcW w:type="dxa" w:w="4536"/>
+          </w:tcPr>
+          <w:p>
+            <w:r>
+              <w:t>apps/api/src/graphql/resolvers/ci-utils.ts</w:t>
+            </w:r>
+          </w:p>
+        </w:tc>
+        <w:tc>
+          <w:tcPr>
+            <w:tcW w:type="dxa" w:w="4536"/>
+          </w:tcPr>
+          <w:p>
+            <w:r>
+              <w:t>Wrapper ciTypeFromLabels; esporta labelToType() per backward compat</w:t>
+            </w:r>
+          </w:p>
+        </w:tc>
+      </w:tr>
+      <w:tr>
+        <w:tc>
+          <w:tcPr>
+            <w:tcW w:type="dxa" w:w="4536"/>
+          </w:tcPr>
+          <w:p>
+            <w:r>
+              <w:t>apps/api/src/graphql/resolvers/topology.ts</w:t>
+            </w:r>
+          </w:p>
+        </w:tc>
+        <w:tc>
+          <w:tcPr>
+            <w:tcW w:type="dxa" w:w="4536"/>
+          </w:tcPr>
+          <w:p>
+            <w:r>
+              <w:t>Resolver topology: MATCH :ConfigurationItem, labels(ci)[0] AS label, ciTypeFromLabels per tipo</w:t>
+            </w:r>
+          </w:p>
+        </w:tc>
+      </w:tr>
+      <w:tr>
+        <w:tc>
+          <w:tcPr>
+            <w:tcW w:type="dxa" w:w="4536"/>
+          </w:tcPr>
+          <w:p>
+            <w:r>
+              <w:t>apps/web/src/pages/topology/TopologyPage.tsx</w:t>
+            </w:r>
+          </w:p>
+        </w:tc>
+        <w:tc>
+          <w:tcPr>
+            <w:tcW w:type="dxa" w:w="4536"/>
+          </w:tcPr>
+          <w:p>
+            <w:r>
+              <w:t>Pagina /topology: D3 force-sim, dropdown GET_CI_TYPES, zoom/pan SVG, tooltip, click→CI detail</w:t>
+            </w:r>
+          </w:p>
+        </w:tc>
+      </w:tr>
     </w:tbl>
     <w:p/>
     <w:p>
@@ -17624,6 +18050,134 @@
           </w:p>
         </w:tc>
       </w:tr>
+      <w:tr>
+        <w:tc>
+          <w:tcPr>
+            <w:tcW w:type="dxa" w:w="3024"/>
+          </w:tcPr>
+          <w:p>
+            <w:r>
+              <w:t>Live Topology Map D3 (force-simulation, zoom/pan, tooltip, click→CI detail)</w:t>
+            </w:r>
+          </w:p>
+        </w:tc>
+        <w:tc>
+          <w:tcPr>
+            <w:tcW w:type="dxa" w:w="3024"/>
+          </w:tcPr>
+          <w:p>
+            <w:r>
+              <w:t>v12</w:t>
+            </w:r>
+          </w:p>
+        </w:tc>
+        <w:tc>
+          <w:tcPr>
+            <w:tcW w:type="dxa" w:w="3024"/>
+          </w:tcPr>
+          <w:p>
+            <w:r>
+              <w:t>✅</w:t>
+            </w:r>
+          </w:p>
+        </w:tc>
+      </w:tr>
+      <w:tr>
+        <w:tc>
+          <w:tcPr>
+            <w:tcW w:type="dxa" w:w="3024"/>
+          </w:tcPr>
+          <w:p>
+            <w:r>
+              <w:t>Dropdown tipo CI dinamico (GET_CI_TYPES — include tipi custom tenant)</w:t>
+            </w:r>
+          </w:p>
+        </w:tc>
+        <w:tc>
+          <w:tcPr>
+            <w:tcW w:type="dxa" w:w="3024"/>
+          </w:tcPr>
+          <w:p>
+            <w:r>
+              <w:t>v12</w:t>
+            </w:r>
+          </w:p>
+        </w:tc>
+        <w:tc>
+          <w:tcPr>
+            <w:tcW w:type="dxa" w:w="3024"/>
+          </w:tcPr>
+          <w:p>
+            <w:r>
+              <w:t>✅</w:t>
+            </w:r>
+          </w:p>
+        </w:tc>
+      </w:tr>
+      <w:tr>
+        <w:tc>
+          <w:tcPr>
+            <w:tcW w:type="dxa" w:w="3024"/>
+          </w:tcPr>
+          <w:p>
+            <w:r>
+              <w:t>Fix architetturale tipo CI da label Neo4j — ciTypeFromLabels (static+dynamic)</w:t>
+            </w:r>
+          </w:p>
+        </w:tc>
+        <w:tc>
+          <w:tcPr>
+            <w:tcW w:type="dxa" w:w="3024"/>
+          </w:tcPr>
+          <w:p>
+            <w:r>
+              <w:t>v12</w:t>
+            </w:r>
+          </w:p>
+        </w:tc>
+        <w:tc>
+          <w:tcPr>
+            <w:tcW w:type="dxa" w:w="3024"/>
+          </w:tcPr>
+          <w:p>
+            <w:r>
+              <w:t>✅</w:t>
+            </w:r>
+          </w:p>
+        </w:tc>
+      </w:tr>
+      <w:tr>
+        <w:tc>
+          <w:tcPr>
+            <w:tcW w:type="dxa" w:w="3024"/>
+          </w:tcPr>
+          <w:p>
+            <w:r>
+              <w:t>Seed label CI corretti (:Application/:Server/:Database) — rimosso ci.type</w:t>
+            </w:r>
+          </w:p>
+        </w:tc>
+        <w:tc>
+          <w:tcPr>
+            <w:tcW w:type="dxa" w:w="3024"/>
+          </w:tcPr>
+          <w:p>
+            <w:r>
+              <w:t>v12</w:t>
+            </w:r>
+          </w:p>
+        </w:tc>
+        <w:tc>
+          <w:tcPr>
+            <w:tcW w:type="dxa" w:w="3024"/>
+          </w:tcPr>
+          <w:p>
+            <w:r>
+              <w:t>✅</w:t>
+            </w:r>
+          </w:p>
+        </w:tc>
+      </w:tr>
     </w:tbl>
     <w:p/>
     <w:p>
@@ -18497,6 +19051,38 @@
                 <w:sz w:val="18"/>
               </w:rPr>
               <w:t>Solo membri team assegnato possono editare un ChangeTask</w:t>
+            </w:r>
+          </w:p>
+        </w:tc>
+      </w:tr>
+      <w:tr>
+        <w:tc>
+          <w:tcPr>
+            <w:tcW w:type="dxa" w:w="3024"/>
+          </w:tcPr>
+          <w:p>
+            <w:r>
+              <w:t>Live Topology Map D3 (filtri dinamici, zoom, tooltip, click CI)</w:t>
+            </w:r>
+          </w:p>
+        </w:tc>
+        <w:tc>
+          <w:tcPr>
+            <w:tcW w:type="dxa" w:w="3024"/>
+          </w:tcPr>
+          <w:p>
+            <w:r>
+              <w:t>—</w:t>
+            </w:r>
+          </w:p>
+        </w:tc>
+        <w:tc>
+          <w:tcPr>
+            <w:tcW w:type="dxa" w:w="3024"/>
+          </w:tcPr>
+          <w:p>
+            <w:r>
+              <w:t>✅ Completato v12</w:t>
             </w:r>
           </w:p>
         </w:tc>

</xml_diff>